<commit_message>
UI + data updates: hero balance, attendance toasts/names/focus, year-level anchor, four text-size levels, surname-first names everywhere
</commit_message>
<xml_diff>
--- a/docs/LIRC_User_Guide.docx
+++ b/docs/LIRC_User_Guide.docx
@@ -55,7 +55,7 @@
           <w:sz w:val="20"/>
           <w:szCs w:val="20"/>
         </w:rPr>
-        <w:t xml:space="preserve">Generated Mon Oct 19 2026</w:t>
+        <w:t xml:space="preserve">Generated Tue Oct 20 2026</w:t>
       </w:r>
     </w:p>
     <w:p>
@@ -1674,6 +1674,29 @@
           <w:sz w:val="21"/>
           <w:szCs w:val="21"/>
         </w:rPr>
+        <w:t xml:space="preserve">The Aa button</w:t>
+      </w:r>
+      <w:r>
+        <w:rPr>
+          <w:sz w:val="21"/>
+          <w:szCs w:val="21"/>
+        </w:rPr>
+        <w:t xml:space="preserve"> — Cycles the text through Normal, Large, Larger and Largest. Only the writing grows — the layout stays exactly the same — and your choice is remembered on this computer.</w:t>
+      </w:r>
+    </w:p>
+    <w:p>
+      <w:pPr>
+        <w:numPr>
+          <w:ilvl w:val="0"/>
+          <w:numId w:val="1"/>
+        </w:numPr>
+      </w:pPr>
+      <w:r>
+        <w:rPr>
+          <w:b/>
+          <w:sz w:val="21"/>
+          <w:szCs w:val="21"/>
+        </w:rPr>
         <w:t xml:space="preserve">The gear (librarians and admins)</w:t>
       </w:r>
       <w:r>
@@ -3645,7 +3668,7 @@
           <w:sz w:val="21"/>
           <w:szCs w:val="21"/>
         </w:rPr>
-        <w:t xml:space="preserve">The purpose buttons (Study, Research, Borrowing/Returning, Computer Use, Others).</w:t>
+        <w:t xml:space="preserve">The purpose buttons (Study, Research, Borrow Books, Return Books, LOA, Exit Clearance, Interview, Thesis, OJT, Others).</w:t>
       </w:r>
     </w:p>
     <w:p>
@@ -3786,6 +3809,21 @@
           <w:szCs w:val="21"/>
         </w:rPr>
         <w:t xml:space="preserve">Scanning someone already inside records their time out — no purpose needed for leaving.</w:t>
+      </w:r>
+    </w:p>
+    <w:p>
+      <w:pPr>
+        <w:numPr>
+          <w:ilvl w:val="0"/>
+          <w:numId w:val="1"/>
+        </w:numPr>
+      </w:pPr>
+      <w:r>
+        <w:rPr>
+          <w:sz w:val="21"/>
+          <w:szCs w:val="21"/>
+        </w:rPr>
+        <w:t xml:space="preserve">The highlighted purpose is easy to spot (bright blue) and is saved with every time in until you change it.</w:t>
       </w:r>
     </w:p>
     <w:p/>
@@ -3942,6 +3980,36 @@
           <w:szCs w:val="21"/>
         </w:rPr>
         <w:t xml:space="preserve">At the borrow desk, a student who is not validated for the current school year cannot borrow.</w:t>
+      </w:r>
+    </w:p>
+    <w:p>
+      <w:pPr>
+        <w:numPr>
+          <w:ilvl w:val="0"/>
+          <w:numId w:val="1"/>
+        </w:numPr>
+      </w:pPr>
+      <w:r>
+        <w:rPr>
+          <w:sz w:val="21"/>
+          <w:szCs w:val="21"/>
+        </w:rPr>
+        <w:t xml:space="preserve">The year level is automatic: the system derives it from the library card and any recorded leave years.</w:t>
+      </w:r>
+    </w:p>
+    <w:p>
+      <w:pPr>
+        <w:numPr>
+          <w:ilvl w:val="0"/>
+          <w:numId w:val="1"/>
+        </w:numPr>
+      </w:pPr>
+      <w:r>
+        <w:rPr>
+          <w:sz w:val="21"/>
+          <w:szCs w:val="21"/>
+        </w:rPr>
+        <w:t xml:space="preserve">Late card or irregular student? Type their real year level once when validating — it is saved for that school year and advances automatically every year after, so you never type it twice.</w:t>
       </w:r>
     </w:p>
     <w:p/>

</xml_diff>